<commit_message>
mostly templated main file
</commit_message>
<xml_diff>
--- a/README.docx
+++ b/README.docx
@@ -1113,13 +1113,7 @@
                   <w:rPr>
                     <w:rFonts w:ascii="Cambria Math" w:hAnsi="Cambria Math" w:cstheme="minorHAnsi"/>
                   </w:rPr>
-                  <m:t>2</m:t>
-                </m:r>
-                <m:r>
-                  <w:rPr>
-                    <w:rFonts w:ascii="Cambria Math" w:hAnsi="Cambria Math" w:cstheme="minorHAnsi"/>
-                  </w:rPr>
-                  <m:t>α</m:t>
+                  <m:t>2α</m:t>
                 </m:r>
               </m:den>
             </m:f>
@@ -1198,13 +1192,7 @@
               <w:rPr>
                 <w:rFonts w:ascii="Cambria Math" w:hAnsi="Cambria Math" w:cstheme="minorHAnsi"/>
               </w:rPr>
-              <m:t>2</m:t>
-            </m:r>
-            <m:r>
-              <w:rPr>
-                <w:rFonts w:ascii="Cambria Math" w:hAnsi="Cambria Math" w:cstheme="minorHAnsi"/>
-              </w:rPr>
-              <m:t>D</m:t>
+              <m:t>2D</m:t>
             </m:r>
           </m:den>
         </m:f>
@@ -1241,19 +1229,7 @@
               <w:rPr>
                 <w:rFonts w:ascii="Cambria Math" w:hAnsi="Cambria Math" w:cstheme="minorHAnsi"/>
               </w:rPr>
-              <m:t>Iv</m:t>
-            </m:r>
-            <m:r>
-              <w:rPr>
-                <w:rFonts w:ascii="Cambria Math" w:hAnsi="Cambria Math" w:cstheme="minorHAnsi"/>
-              </w:rPr>
-              <m:t>(</m:t>
-            </m:r>
-            <m:r>
-              <w:rPr>
-                <w:rFonts w:ascii="Cambria Math" w:hAnsi="Cambria Math" w:cstheme="minorHAnsi"/>
-              </w:rPr>
-              <m:t>P</m:t>
+              <m:t>Iv(P</m:t>
             </m:r>
           </m:e>
           <m:sub>
@@ -1440,19 +1416,7 @@
               <w:rPr>
                 <w:rFonts w:ascii="Cambria Math" w:hAnsi="Cambria Math" w:cstheme="minorHAnsi"/>
               </w:rPr>
-              <m:t>Iv</m:t>
-            </m:r>
-            <m:r>
-              <w:rPr>
-                <w:rFonts w:ascii="Cambria Math" w:hAnsi="Cambria Math" w:cstheme="minorHAnsi"/>
-              </w:rPr>
-              <m:t>(</m:t>
-            </m:r>
-            <m:r>
-              <w:rPr>
-                <w:rFonts w:ascii="Cambria Math" w:hAnsi="Cambria Math" w:cstheme="minorHAnsi"/>
-              </w:rPr>
-              <m:t>P</m:t>
+              <m:t>Iv(P</m:t>
             </m:r>
           </m:e>
           <m:sub>
@@ -1830,43 +1794,7 @@
           <w:sz w:val="22"/>
           <w:szCs w:val="22"/>
         </w:rPr>
-        <w:t xml:space="preserve"> </w:t>
-      </w:r>
-      <w:proofErr w:type="spellStart"/>
-      <w:r>
-        <w:rPr>
-          <w:rFonts w:eastAsiaTheme="minorEastAsia"/>
-          <w:sz w:val="22"/>
-          <w:szCs w:val="22"/>
-        </w:rPr>
-        <w:t>solutal</w:t>
-      </w:r>
-      <w:proofErr w:type="spellEnd"/>
-      <w:r>
-        <w:rPr>
-          <w:rFonts w:eastAsiaTheme="minorEastAsia"/>
-          <w:sz w:val="22"/>
-          <w:szCs w:val="22"/>
-        </w:rPr>
-        <w:t xml:space="preserve"> </w:t>
-      </w:r>
-      <w:proofErr w:type="spellStart"/>
-      <w:r>
-        <w:rPr>
-          <w:rFonts w:eastAsiaTheme="minorEastAsia"/>
-          <w:sz w:val="22"/>
-          <w:szCs w:val="22"/>
-        </w:rPr>
-        <w:t>Ivantsov</w:t>
-      </w:r>
-      <w:proofErr w:type="spellEnd"/>
-      <w:r>
-        <w:rPr>
-          <w:rFonts w:eastAsiaTheme="minorEastAsia"/>
-          <w:sz w:val="22"/>
-          <w:szCs w:val="22"/>
-        </w:rPr>
-        <w:t xml:space="preserve"> function.</w:t>
+        <w:t xml:space="preserve"> solutal Ivantsov function.</w:t>
       </w:r>
     </w:p>
     <w:p>
@@ -2022,69 +1950,15 @@
           <w:sz w:val="22"/>
           <w:szCs w:val="22"/>
         </w:rPr>
-        <w:t xml:space="preserve"> </w:t>
-      </w:r>
-      <w:proofErr w:type="spellStart"/>
-      <w:r>
-        <w:rPr>
-          <w:rFonts w:eastAsiaTheme="minorEastAsia"/>
-          <w:sz w:val="22"/>
-          <w:szCs w:val="22"/>
-        </w:rPr>
-        <w:t>solutal</w:t>
-      </w:r>
-      <w:proofErr w:type="spellEnd"/>
-      <w:r>
-        <w:rPr>
-          <w:rFonts w:eastAsiaTheme="minorEastAsia"/>
-          <w:sz w:val="22"/>
-          <w:szCs w:val="22"/>
-        </w:rPr>
-        <w:t xml:space="preserve"> </w:t>
-      </w:r>
-      <w:proofErr w:type="spellStart"/>
-      <w:r>
-        <w:rPr>
-          <w:rFonts w:eastAsiaTheme="minorEastAsia"/>
-          <w:sz w:val="22"/>
-          <w:szCs w:val="22"/>
-        </w:rPr>
-        <w:t>Péclet</w:t>
-      </w:r>
-      <w:proofErr w:type="spellEnd"/>
-      <w:r>
-        <w:rPr>
-          <w:rFonts w:eastAsiaTheme="minorEastAsia"/>
-          <w:sz w:val="22"/>
-          <w:szCs w:val="22"/>
-        </w:rPr>
-        <w:t xml:space="preserve"> number</w:t>
-      </w:r>
-      <w:r>
-        <w:rPr>
-          <w:rFonts w:eastAsiaTheme="minorEastAsia"/>
-          <w:sz w:val="22"/>
-          <w:szCs w:val="22"/>
-        </w:rPr>
-        <w:t xml:space="preserve">.  In </w:t>
-      </w:r>
-      <w:proofErr w:type="spellStart"/>
-      <w:r>
-        <w:rPr>
-          <w:rFonts w:eastAsiaTheme="minorEastAsia"/>
-          <w:sz w:val="22"/>
-          <w:szCs w:val="22"/>
-        </w:rPr>
-        <w:t>Matlab</w:t>
-      </w:r>
-      <w:proofErr w:type="spellEnd"/>
-      <w:r>
-        <w:rPr>
-          <w:rFonts w:eastAsiaTheme="minorEastAsia"/>
-          <w:sz w:val="22"/>
-          <w:szCs w:val="22"/>
-        </w:rPr>
-        <w:t xml:space="preserve">, </w:t>
+        <w:t xml:space="preserve"> solutal Péclet number</w:t>
+      </w:r>
+      <w:r>
+        <w:rPr>
+          <w:rFonts w:eastAsiaTheme="minorEastAsia"/>
+          <w:sz w:val="22"/>
+          <w:szCs w:val="22"/>
+        </w:rPr>
+        <w:t xml:space="preserve">.  In Matlab, </w:t>
       </w:r>
       <w:r>
         <w:rPr>
@@ -2110,23 +1984,13 @@
         </w:rPr>
         <w:t xml:space="preserve">written </w:t>
       </w:r>
-      <w:proofErr w:type="spellStart"/>
-      <w:r>
-        <w:rPr>
-          <w:rFonts w:eastAsiaTheme="minorEastAsia"/>
-          <w:sz w:val="22"/>
-          <w:szCs w:val="22"/>
-        </w:rPr>
-        <w:t>expint</w:t>
-      </w:r>
-      <w:proofErr w:type="spellEnd"/>
-      <w:r>
-        <w:rPr>
-          <w:rFonts w:eastAsiaTheme="minorEastAsia"/>
-          <w:sz w:val="22"/>
-          <w:szCs w:val="22"/>
-        </w:rPr>
-        <w:t>(</w:t>
+      <w:r>
+        <w:rPr>
+          <w:rFonts w:eastAsiaTheme="minorEastAsia"/>
+          <w:sz w:val="22"/>
+          <w:szCs w:val="22"/>
+        </w:rPr>
+        <w:t>expint(</w:t>
       </w:r>
       <w:r>
         <w:rPr>
@@ -2359,25 +2223,7 @@
           <w:sz w:val="22"/>
           <w:szCs w:val="22"/>
         </w:rPr>
-        <w:t>J/(</w:t>
-      </w:r>
-      <w:proofErr w:type="spellStart"/>
-      <w:r>
-        <w:rPr>
-          <w:rFonts w:eastAsiaTheme="minorEastAsia"/>
-          <w:sz w:val="22"/>
-          <w:szCs w:val="22"/>
-        </w:rPr>
-        <w:t>kg∙K</w:t>
-      </w:r>
-      <w:proofErr w:type="spellEnd"/>
-      <w:r>
-        <w:rPr>
-          <w:rFonts w:eastAsiaTheme="minorEastAsia"/>
-          <w:sz w:val="22"/>
-          <w:szCs w:val="22"/>
-        </w:rPr>
-        <w:t>)</w:t>
+        <w:t>J/(kg∙K)</w:t>
       </w:r>
     </w:p>
     <w:p>
@@ -2530,16 +2376,7 @@
           <w:sz w:val="22"/>
           <w:szCs w:val="22"/>
         </w:rPr>
-        <w:t xml:space="preserve">. Units: </w:t>
-      </w:r>
-      <w:proofErr w:type="spellStart"/>
-      <w:r>
-        <w:rPr>
-          <w:rFonts w:eastAsiaTheme="minorEastAsia"/>
-          <w:sz w:val="22"/>
-          <w:szCs w:val="22"/>
-        </w:rPr>
-        <w:t>K</w:t>
+        <w:t>. Units: K</w:t>
       </w:r>
       <w:r>
         <w:rPr>
@@ -2557,7 +2394,6 @@
         </w:rPr>
         <w:t>m</w:t>
       </w:r>
-      <w:proofErr w:type="spellEnd"/>
     </w:p>
     <w:p>
       <w:pPr>
@@ -2901,25 +2737,7 @@
           <w:sz w:val="22"/>
           <w:szCs w:val="22"/>
         </w:rPr>
-        <w:t>J/(</w:t>
-      </w:r>
-      <w:proofErr w:type="spellStart"/>
-      <w:r>
-        <w:rPr>
-          <w:rFonts w:eastAsiaTheme="minorEastAsia"/>
-          <w:sz w:val="22"/>
-          <w:szCs w:val="22"/>
-        </w:rPr>
-        <w:t>kg∙K</w:t>
-      </w:r>
-      <w:proofErr w:type="spellEnd"/>
-      <w:r>
-        <w:rPr>
-          <w:rFonts w:eastAsiaTheme="minorEastAsia"/>
-          <w:sz w:val="22"/>
-          <w:szCs w:val="22"/>
-        </w:rPr>
-        <w:t>)</w:t>
+        <w:t>J/(kg∙K)</w:t>
       </w:r>
     </w:p>
     <w:p>
@@ -4275,12 +4093,6 @@
                     </m:sSub>
                   </m:e>
                 </m:d>
-                <m:r>
-                  <w:rPr>
-                    <w:rFonts w:ascii="Cambria Math" w:eastAsiaTheme="minorEastAsia" w:hAnsi="Cambria Math"/>
-                  </w:rPr>
-                  <m:t>d</m:t>
-                </m:r>
                 <m:sSub>
                   <m:sSubPr>
                     <m:ctrlPr>
@@ -4713,12 +4525,6 @@
                     </m:sSub>
                   </m:e>
                 </m:d>
-                <m:r>
-                  <w:rPr>
-                    <w:rFonts w:ascii="Cambria Math" w:eastAsiaTheme="minorEastAsia" w:hAnsi="Cambria Math"/>
-                  </w:rPr>
-                  <m:t>d</m:t>
-                </m:r>
                 <m:sSub>
                   <m:sSubPr>
                     <m:ctrlPr>
@@ -4885,13 +4691,7 @@
                         <w:rPr>
                           <w:rFonts w:ascii="Cambria Math" w:eastAsiaTheme="minorEastAsia" w:hAnsi="Cambria Math"/>
                         </w:rPr>
-                        <m:t>n</m:t>
-                      </m:r>
-                      <m:r>
-                        <w:rPr>
-                          <w:rFonts w:ascii="Cambria Math" w:eastAsiaTheme="minorEastAsia" w:hAnsi="Cambria Math"/>
-                        </w:rPr>
-                        <m:t>+1</m:t>
+                        <m:t>n+1</m:t>
                       </m:r>
                     </m:sub>
                   </m:sSub>
@@ -4921,13 +4721,7 @@
                         <w:rPr>
                           <w:rFonts w:ascii="Cambria Math" w:eastAsiaTheme="minorEastAsia" w:hAnsi="Cambria Math"/>
                         </w:rPr>
-                        <m:t>n</m:t>
-                      </m:r>
-                      <m:r>
-                        <w:rPr>
-                          <w:rFonts w:ascii="Cambria Math" w:eastAsiaTheme="minorEastAsia" w:hAnsi="Cambria Math"/>
-                        </w:rPr>
-                        <m:t>+1</m:t>
+                        <m:t>n+1</m:t>
                       </m:r>
                     </m:sub>
                   </m:sSub>
@@ -5065,13 +4859,7 @@
               <w:rPr>
                 <w:rFonts w:ascii="Cambria Math" w:eastAsiaTheme="minorEastAsia" w:hAnsi="Cambria Math"/>
               </w:rPr>
-              <m:t>-</m:t>
-            </m:r>
-            <m:r>
-              <w:rPr>
-                <w:rFonts w:ascii="Cambria Math" w:eastAsiaTheme="minorEastAsia" w:hAnsi="Cambria Math"/>
-              </w:rPr>
-              <m:t>1</m:t>
+              <m:t>-1</m:t>
             </m:r>
           </m:sup>
         </m:sSup>
@@ -5180,13 +4968,7 @@
                     <w:rPr>
                       <w:rFonts w:ascii="Cambria Math" w:eastAsiaTheme="minorEastAsia" w:hAnsi="Cambria Math"/>
                     </w:rPr>
-                    <m:t>f</m:t>
-                  </m:r>
-                  <m:r>
-                    <w:rPr>
-                      <w:rFonts w:ascii="Cambria Math" w:eastAsiaTheme="minorEastAsia" w:hAnsi="Cambria Math"/>
-                    </w:rPr>
-                    <m:t>1</m:t>
+                    <m:t>f1</m:t>
                   </m:r>
                   <m:d>
                     <m:dPr>
@@ -5266,13 +5048,7 @@
                     <w:rPr>
                       <w:rFonts w:ascii="Cambria Math" w:eastAsiaTheme="minorEastAsia" w:hAnsi="Cambria Math"/>
                     </w:rPr>
-                    <m:t>f</m:t>
-                  </m:r>
-                  <m:r>
-                    <w:rPr>
-                      <w:rFonts w:ascii="Cambria Math" w:eastAsiaTheme="minorEastAsia" w:hAnsi="Cambria Math"/>
-                    </w:rPr>
-                    <m:t>2</m:t>
+                    <m:t>f2</m:t>
                   </m:r>
                   <m:d>
                     <m:dPr>
@@ -6394,13 +6170,7 @@
               <w:rPr>
                 <w:rFonts w:ascii="Cambria Math" w:hAnsi="Cambria Math" w:cstheme="minorHAnsi"/>
               </w:rPr>
-              <m:t>f</m:t>
-            </m:r>
-            <m:r>
-              <w:rPr>
-                <w:rFonts w:ascii="Cambria Math" w:hAnsi="Cambria Math" w:cstheme="minorHAnsi"/>
-              </w:rPr>
-              <m:t>1</m:t>
+              <m:t>f1</m:t>
             </m:r>
           </m:num>
           <m:den>
@@ -6850,13 +6620,7 @@
               <w:rPr>
                 <w:rFonts w:ascii="Cambria Math" w:hAnsi="Cambria Math" w:cstheme="minorHAnsi"/>
               </w:rPr>
-              <m:t>f</m:t>
-            </m:r>
-            <m:r>
-              <w:rPr>
-                <w:rFonts w:ascii="Cambria Math" w:hAnsi="Cambria Math" w:cstheme="minorHAnsi"/>
-              </w:rPr>
-              <m:t>1</m:t>
+              <m:t>f1</m:t>
             </m:r>
           </m:num>
           <m:den>
@@ -7254,13 +7018,7 @@
               <w:rPr>
                 <w:rFonts w:ascii="Cambria Math" w:hAnsi="Cambria Math" w:cstheme="minorHAnsi"/>
               </w:rPr>
-              <m:t>2</m:t>
-            </m:r>
-            <m:r>
-              <w:rPr>
-                <w:rFonts w:ascii="Cambria Math" w:hAnsi="Cambria Math" w:cstheme="minorHAnsi"/>
-              </w:rPr>
-              <m:t>Γ</m:t>
+              <m:t>2Γ</m:t>
             </m:r>
           </m:num>
           <m:den>
@@ -7352,13 +7110,7 @@
               <w:rPr>
                 <w:rFonts w:ascii="Cambria Math" w:eastAsiaTheme="minorEastAsia" w:hAnsi="Cambria Math"/>
               </w:rPr>
-              <m:t>∂f</m:t>
-            </m:r>
-            <m:r>
-              <w:rPr>
-                <w:rFonts w:ascii="Cambria Math" w:eastAsiaTheme="minorEastAsia" w:hAnsi="Cambria Math"/>
-              </w:rPr>
-              <m:t>2</m:t>
+              <m:t>∂f2</m:t>
             </m:r>
           </m:num>
           <m:den>
@@ -7520,13 +7272,7 @@
                   <w:rPr>
                     <w:rFonts w:ascii="Cambria Math" w:hAnsi="Cambria Math" w:cstheme="minorHAnsi"/>
                   </w:rPr>
-                  <m:t>2</m:t>
-                </m:r>
-                <m:r>
-                  <w:rPr>
-                    <w:rFonts w:ascii="Cambria Math" w:hAnsi="Cambria Math" w:cstheme="minorHAnsi"/>
-                  </w:rPr>
-                  <m:t>α</m:t>
+                  <m:t>2α</m:t>
                 </m:r>
                 <m:sSub>
                   <m:sSubPr>
@@ -7752,13 +7498,7 @@
                   <w:rPr>
                     <w:rFonts w:ascii="Cambria Math" w:hAnsi="Cambria Math" w:cstheme="minorHAnsi"/>
                   </w:rPr>
-                  <m:t>2</m:t>
-                </m:r>
-                <m:r>
-                  <w:rPr>
-                    <w:rFonts w:ascii="Cambria Math" w:hAnsi="Cambria Math" w:cstheme="minorHAnsi"/>
-                  </w:rPr>
-                  <m:t>D</m:t>
+                  <m:t>2D</m:t>
                 </m:r>
               </m:den>
             </m:f>
@@ -8106,13 +7846,7 @@
               <w:rPr>
                 <w:rFonts w:ascii="Cambria Math" w:eastAsiaTheme="minorEastAsia" w:hAnsi="Cambria Math"/>
               </w:rPr>
-              <m:t>∂f</m:t>
-            </m:r>
-            <m:r>
-              <w:rPr>
-                <w:rFonts w:ascii="Cambria Math" w:eastAsiaTheme="minorEastAsia" w:hAnsi="Cambria Math"/>
-              </w:rPr>
-              <m:t>2</m:t>
+              <m:t>∂f2</m:t>
             </m:r>
           </m:num>
           <m:den>
@@ -8290,13 +8024,7 @@
                       <w:rPr>
                         <w:rFonts w:ascii="Cambria Math" w:hAnsi="Cambria Math" w:cstheme="minorHAnsi"/>
                       </w:rPr>
-                      <m:t>2</m:t>
-                    </m:r>
-                    <m:r>
-                      <w:rPr>
-                        <w:rFonts w:ascii="Cambria Math" w:hAnsi="Cambria Math" w:cstheme="minorHAnsi"/>
-                      </w:rPr>
-                      <m:t>α</m:t>
+                      <m:t>2α</m:t>
                     </m:r>
                     <m:sSub>
                       <m:sSubPr>
@@ -8522,13 +8250,7 @@
                       <w:rPr>
                         <w:rFonts w:ascii="Cambria Math" w:hAnsi="Cambria Math" w:cstheme="minorHAnsi"/>
                       </w:rPr>
-                      <m:t>2</m:t>
-                    </m:r>
-                    <m:r>
-                      <w:rPr>
-                        <w:rFonts w:ascii="Cambria Math" w:hAnsi="Cambria Math" w:cstheme="minorHAnsi"/>
-                      </w:rPr>
-                      <m:t>D</m:t>
+                      <m:t>2D</m:t>
                     </m:r>
                   </m:den>
                 </m:f>
@@ -8846,13 +8568,7 @@
           <w:rPr>
             <w:rFonts w:ascii="Cambria Math" w:hAnsi="Cambria Math" w:cstheme="minorHAnsi"/>
           </w:rPr>
-          <m:t>-</m:t>
-        </m:r>
-        <m:r>
-          <w:rPr>
-            <w:rFonts w:ascii="Cambria Math" w:hAnsi="Cambria Math" w:cstheme="minorHAnsi"/>
-          </w:rPr>
-          <m:t>1</m:t>
+          <m:t>-1</m:t>
         </m:r>
       </m:oMath>
       <w:r>
@@ -9141,13 +8857,7 @@
               <w:rPr>
                 <w:rFonts w:ascii="Cambria Math" w:eastAsiaTheme="minorEastAsia" w:hAnsi="Cambria Math"/>
               </w:rPr>
-              <m:t>-</m:t>
-            </m:r>
-            <m:r>
-              <w:rPr>
-                <w:rFonts w:ascii="Cambria Math" w:eastAsiaTheme="minorEastAsia" w:hAnsi="Cambria Math"/>
-              </w:rPr>
-              <m:t>1</m:t>
+              <m:t>-1</m:t>
             </m:r>
           </m:e>
         </m:d>
@@ -9179,13 +8889,7 @@
               <w:rPr>
                 <w:rFonts w:ascii="Cambria Math" w:eastAsiaTheme="minorEastAsia" w:hAnsi="Cambria Math"/>
               </w:rPr>
-              <m:t>2</m:t>
-            </m:r>
-            <m:r>
-              <w:rPr>
-                <w:rFonts w:ascii="Cambria Math" w:eastAsiaTheme="minorEastAsia" w:hAnsi="Cambria Math"/>
-              </w:rPr>
-              <m:t>D</m:t>
+              <m:t>2D</m:t>
             </m:r>
           </m:den>
         </m:f>
@@ -9471,13 +9175,7 @@
               <w:rPr>
                 <w:rFonts w:ascii="Cambria Math" w:eastAsiaTheme="minorEastAsia" w:hAnsi="Cambria Math"/>
               </w:rPr>
-              <m:t>-</m:t>
-            </m:r>
-            <m:r>
-              <w:rPr>
-                <w:rFonts w:ascii="Cambria Math" w:eastAsiaTheme="minorEastAsia" w:hAnsi="Cambria Math"/>
-              </w:rPr>
-              <m:t>1</m:t>
+              <m:t>-1</m:t>
             </m:r>
           </m:e>
         </m:d>
@@ -9509,13 +9207,7 @@
               <w:rPr>
                 <w:rFonts w:ascii="Cambria Math" w:eastAsiaTheme="minorEastAsia" w:hAnsi="Cambria Math"/>
               </w:rPr>
-              <m:t>2</m:t>
-            </m:r>
-            <m:r>
-              <w:rPr>
-                <w:rFonts w:ascii="Cambria Math" w:eastAsiaTheme="minorEastAsia" w:hAnsi="Cambria Math"/>
-              </w:rPr>
-              <m:t>D</m:t>
+              <m:t>2D</m:t>
             </m:r>
           </m:den>
         </m:f>
@@ -9810,13 +9502,7 @@
               <w:rPr>
                 <w:rFonts w:ascii="Cambria Math" w:eastAsiaTheme="minorEastAsia" w:hAnsi="Cambria Math"/>
               </w:rPr>
-              <m:t>-</m:t>
-            </m:r>
-            <m:r>
-              <w:rPr>
-                <w:rFonts w:ascii="Cambria Math" w:eastAsiaTheme="minorEastAsia" w:hAnsi="Cambria Math"/>
-              </w:rPr>
-              <m:t>1</m:t>
+              <m:t>-1</m:t>
             </m:r>
           </m:e>
         </m:d>
@@ -9848,13 +9534,7 @@
               <w:rPr>
                 <w:rFonts w:ascii="Cambria Math" w:eastAsiaTheme="minorEastAsia" w:hAnsi="Cambria Math"/>
               </w:rPr>
-              <m:t>2</m:t>
-            </m:r>
-            <m:r>
-              <w:rPr>
-                <w:rFonts w:ascii="Cambria Math" w:eastAsiaTheme="minorEastAsia" w:hAnsi="Cambria Math"/>
-              </w:rPr>
-              <m:t>D</m:t>
+              <m:t>2D</m:t>
             </m:r>
           </m:den>
         </m:f>
@@ -10138,13 +9818,7 @@
               <w:rPr>
                 <w:rFonts w:ascii="Cambria Math" w:eastAsiaTheme="minorEastAsia" w:hAnsi="Cambria Math"/>
               </w:rPr>
-              <m:t>-</m:t>
-            </m:r>
-            <m:r>
-              <w:rPr>
-                <w:rFonts w:ascii="Cambria Math" w:eastAsiaTheme="minorEastAsia" w:hAnsi="Cambria Math"/>
-              </w:rPr>
-              <m:t>1</m:t>
+              <m:t>-1</m:t>
             </m:r>
           </m:e>
         </m:d>
@@ -10176,13 +9850,7 @@
               <w:rPr>
                 <w:rFonts w:ascii="Cambria Math" w:eastAsiaTheme="minorEastAsia" w:hAnsi="Cambria Math"/>
               </w:rPr>
-              <m:t>2</m:t>
-            </m:r>
-            <m:r>
-              <w:rPr>
-                <w:rFonts w:ascii="Cambria Math" w:eastAsiaTheme="minorEastAsia" w:hAnsi="Cambria Math"/>
-              </w:rPr>
-              <m:t>D</m:t>
+              <m:t>2D</m:t>
             </m:r>
           </m:den>
         </m:f>
@@ -10762,21 +10430,7 @@
         <w:rPr>
           <w:rFonts w:eastAsiaTheme="minorEastAsia"/>
         </w:rPr>
-        <w:t xml:space="preserve">Dantzig &amp; </w:t>
-      </w:r>
-      <w:proofErr w:type="spellStart"/>
-      <w:r>
-        <w:rPr>
-          <w:rFonts w:eastAsiaTheme="minorEastAsia"/>
-        </w:rPr>
-        <w:t>Rappaz</w:t>
-      </w:r>
-      <w:proofErr w:type="spellEnd"/>
-      <w:r>
-        <w:rPr>
-          <w:rFonts w:eastAsiaTheme="minorEastAsia"/>
-        </w:rPr>
-        <w:t xml:space="preserve"> (1</w:t>
+        <w:t>Dantzig &amp; Rappaz (1</w:t>
       </w:r>
       <w:r>
         <w:rPr>
@@ -10825,21 +10479,7 @@
         <w:rPr>
           <w:rFonts w:eastAsiaTheme="minorEastAsia"/>
         </w:rPr>
-        <w:t xml:space="preserve"> and (ii) for </w:t>
-      </w:r>
-      <w:proofErr w:type="spellStart"/>
-      <w:r>
-        <w:rPr>
-          <w:rFonts w:eastAsiaTheme="minorEastAsia"/>
-        </w:rPr>
-        <w:t>solutal</w:t>
-      </w:r>
-      <w:proofErr w:type="spellEnd"/>
-      <w:r>
-        <w:rPr>
-          <w:rFonts w:eastAsiaTheme="minorEastAsia"/>
-        </w:rPr>
-        <w:t xml:space="preserve"> dendrites</w:t>
+        <w:t xml:space="preserve"> and (ii) for solutal dendrites</w:t>
       </w:r>
       <w:r>
         <w:rPr>
@@ -11448,25 +11088,7 @@
           <w:sz w:val="20"/>
           <w:szCs w:val="20"/>
         </w:rPr>
-        <w:t xml:space="preserve">W.J. Boettinger, S.R. Coriell, R. Trivedi, Application of dendritic growth theory to the interpretation of rapid solidification microstructures, Rapid </w:t>
-      </w:r>
-      <w:proofErr w:type="spellStart"/>
-      <w:r>
-        <w:rPr>
-          <w:rFonts w:eastAsiaTheme="minorEastAsia"/>
-          <w:sz w:val="20"/>
-          <w:szCs w:val="20"/>
-        </w:rPr>
-        <w:t>Solidif</w:t>
-      </w:r>
-      <w:proofErr w:type="spellEnd"/>
-      <w:r>
-        <w:rPr>
-          <w:rFonts w:eastAsiaTheme="minorEastAsia"/>
-          <w:sz w:val="20"/>
-          <w:szCs w:val="20"/>
-        </w:rPr>
-        <w:t>. Process. Princ. Technol. IV (1988) 13.</w:t>
+        <w:t>W.J. Boettinger, S.R. Coriell, R. Trivedi, Application of dendritic growth theory to the interpretation of rapid solidification microstructures, Rapid Solidif. Process. Princ. Technol. IV (1988) 13.</w:t>
       </w:r>
     </w:p>
     <w:p>
@@ -11522,11 +11144,9 @@
       <w:pPr>
         <w:spacing w:line="259" w:lineRule="auto"/>
       </w:pPr>
-      <w:proofErr w:type="gramStart"/>
       <w:r>
         <w:t>Also..</w:t>
       </w:r>
-      <w:proofErr w:type="gramEnd"/>
     </w:p>
     <w:p>
       <w:pPr>
@@ -11538,15 +11158,7 @@
         <w:spacing w:line="259" w:lineRule="auto"/>
       </w:pPr>
       <w:r>
-        <w:t xml:space="preserve">Rodriguez, J. E., Kreischer, C., Volkmann, T., &amp; Matson, D. M. (2017). Solidification velocity of undercooled Fe-Co alloys. Acta </w:t>
-      </w:r>
-      <w:proofErr w:type="spellStart"/>
-      <w:r>
-        <w:t>Materialia</w:t>
-      </w:r>
-      <w:proofErr w:type="spellEnd"/>
-      <w:r>
-        <w:t xml:space="preserve">, 122, 431–437. </w:t>
+        <w:t xml:space="preserve">Rodriguez, J. E., Kreischer, C., Volkmann, T., &amp; Matson, D. M. (2017). Solidification velocity of undercooled Fe-Co alloys. Acta Materialia, 122, 431–437. </w:t>
       </w:r>
       <w:hyperlink r:id="rId8" w:history="1">
         <w:r>
@@ -11654,21 +11266,7 @@
         <w:rPr>
           <w:rFonts w:eastAsiaTheme="minorEastAsia"/>
         </w:rPr>
-        <w:t xml:space="preserve">Boettinger WJ, Bendersky LA, Early JG. An analysis of the microstructure of rapidly solidified Al-8 </w:t>
-      </w:r>
-      <w:proofErr w:type="spellStart"/>
-      <w:r>
-        <w:rPr>
-          <w:rFonts w:eastAsiaTheme="minorEastAsia"/>
-        </w:rPr>
-        <w:t>wt</w:t>
-      </w:r>
-      <w:proofErr w:type="spellEnd"/>
-      <w:r>
-        <w:rPr>
-          <w:rFonts w:eastAsiaTheme="minorEastAsia"/>
-        </w:rPr>
-        <w:t xml:space="preserve"> pct Fe powder. Metall Trans A. 1986 May;17:</w:t>
+        <w:t>Boettinger WJ, Bendersky LA, Early JG. An analysis of the microstructure of rapidly solidified Al-8 wt pct Fe powder. Metall Trans A. 1986 May;17:</w:t>
       </w:r>
       <w:r>
         <w:rPr>
@@ -19491,6 +19089,7 @@
   <w:style w:type="character" w:default="1" w:styleId="DefaultParagraphFont">
     <w:name w:val="Default Paragraph Font"/>
     <w:uiPriority w:val="1"/>
+    <w:semiHidden/>
     <w:unhideWhenUsed/>
   </w:style>
   <w:style w:type="table" w:default="1" w:styleId="TableNormal">

</xml_diff>